<commit_message>
mln133: điền thông tin Nhóm 2 lên bìa, bỏ phân công người nói trên slide và kịch bản
Co-Authored-By: Claude Opus 5.5 <noreply@anthropic.com>
Claude-Session: https://claude.ai/code/session_01RW9TZJvbvsULL2ZCRN76uC
</commit_message>
<xml_diff>
--- a/mln133/Kich_ban_thuyet_trinh_tung_slide.docx
+++ b/mln133/Kich_ban_thuyet_trinh_tung_slide.docx
@@ -40,7 +40,21 @@
           <w:color w:val="6B6B6B"/>
           <w:sz w:val="22"/>
         </w:rPr>
-        <w:t>Lớp: [điền] · Nhóm: [điền] · Thành viên: [Họ tên – MSSV] × 4 · Tổng thời lượng khoảng 32–33 phút</w:t>
+        <w:t>Nhóm 2 · Phan Thanh Đức (SE181719) · Hồ Trần Quân (SE180175) · Phan Văn Huy (SE184969) · Hồ Quốc Đạt (SE193114) · Nguyễn Thị Mai Vỹ (SE193020)</w:t>
+      </w:r>
+    </w:p>
+    <w:p>
+      <w:pPr>
+        <w:spacing w:after="120"/>
+      </w:pPr>
+      <w:r>
+        <w:rPr>
+          <w:b w:val="0"/>
+          <w:i w:val="0"/>
+          <w:color w:val="6B6B6B"/>
+          <w:sz w:val="22"/>
+        </w:rPr>
+        <w:t>Tổng thời lượng khoảng 32–33 phút. Nhóm tự chia người nói; mốc thời gian chỉ để canh nhịp.</w:t>
       </w:r>
     </w:p>
     <w:p>
@@ -161,7 +175,7 @@
           <w:color w:val="6B6B6B"/>
           <w:sz w:val="22"/>
         </w:rPr>
-        <w:t>Thành viên 1 · 0:00–0:20</w:t>
+        <w:t>Thời gian gợi ý: 0:00–0:20</w:t>
       </w:r>
     </w:p>
     <w:p>
@@ -188,7 +202,7 @@
           <w:i w:val="0"/>
           <w:sz w:val="24"/>
         </w:rPr>
-        <w:t>Em chào thầy/cô và các bạn. Nhóm em là nhóm [..]. Hôm nay nhóm em trình bày mục III của chương 4: Dân chủ xã hội chủ nghĩa và Nhà nước pháp quyền xã hội chủ nghĩa ở Việt Nam.</w:t>
+        <w:t>Em chào thầy/cô và các bạn. Nhóm em là nhóm 2. Hôm nay nhóm em trình bày mục III của chương 4: Dân chủ xã hội chủ nghĩa và Nhà nước pháp quyền xã hội chủ nghĩa ở Việt Nam.</w:t>
       </w:r>
     </w:p>
     <w:p>
@@ -221,7 +235,7 @@
           <w:color w:val="6B6B6B"/>
           <w:sz w:val="22"/>
         </w:rPr>
-        <w:t>Thành viên 1 · 0:20–1:10</w:t>
+        <w:t>Thời gian gợi ý: 0:20–1:10</w:t>
       </w:r>
     </w:p>
     <w:p>
@@ -248,7 +262,7 @@
           <w:i w:val="0"/>
           <w:sz w:val="24"/>
         </w:rPr>
-        <w:t>Bài của nhóm em có ba phần. Phần một là dân chủ xã hội chủ nghĩa ở Việt Nam: nó hình thành, phát triển ra sao và bản chất của nó là gì. Phần này em và bạn [thành viên 2] trình bày.</w:t>
+        <w:t>Bài của nhóm em có ba phần. Phần một là dân chủ xã hội chủ nghĩa ở Việt Nam: nó hình thành, phát triển ra sao và bản chất của nó là gì.</w:t>
       </w:r>
     </w:p>
     <w:p>
@@ -261,7 +275,7 @@
           <w:i w:val="0"/>
           <w:sz w:val="24"/>
         </w:rPr>
-        <w:t>Phần hai, bạn [thành viên 3] sẽ nói về Nhà nước pháp quyền xã hội chủ nghĩa: hiểu nó thế nào và nó có những đặc điểm gì. Phần ba, bạn [thành viên 4] trình bày những việc cần làm hiện nay để phát huy dân chủ và hoàn thiện Nhà nước pháp quyền.</w:t>
+        <w:t>Phần hai nói về Nhà nước pháp quyền xã hội chủ nghĩa: hiểu nó thế nào và nó có những đặc điểm gì. Phần ba là những việc cần làm hiện nay để phát huy dân chủ và hoàn thiện Nhà nước pháp quyền.</w:t>
       </w:r>
     </w:p>
     <w:p>
@@ -274,7 +288,7 @@
           <w:i w:val="0"/>
           <w:sz w:val="24"/>
         </w:rPr>
-        <w:t>Cuối cùng em sẽ tóm lại cả bài trên một slide, rồi mời thầy/cô và các bạn đặt câu hỏi. Giữa chừng nhóm em có vài chỗ hỏi nhanh, các bạn cứ trả lời thoải mái nhé.</w:t>
+        <w:t>Cuối cùng nhóm em tóm lại cả bài trên một slide, rồi mời thầy/cô và các bạn đặt câu hỏi. Giữa chừng nhóm em có vài chỗ hỏi nhanh, các bạn cứ trả lời thoải mái nhé.</w:t>
       </w:r>
     </w:p>
     <w:p>
@@ -322,7 +336,7 @@
           <w:color w:val="6B6B6B"/>
           <w:sz w:val="22"/>
         </w:rPr>
-        <w:t>Thành viên 1 · 1:10–2:00</w:t>
+        <w:t>Thời gian gợi ý: 1:10–2:00</w:t>
       </w:r>
     </w:p>
     <w:p>
@@ -423,7 +437,7 @@
           <w:color w:val="6B6B6B"/>
           <w:sz w:val="22"/>
         </w:rPr>
-        <w:t>Thành viên 1 · 2:00–3:15</w:t>
+        <w:t>Thời gian gợi ý: 2:00–3:15</w:t>
       </w:r>
     </w:p>
     <w:p>
@@ -537,7 +551,7 @@
           <w:color w:val="6B6B6B"/>
           <w:sz w:val="22"/>
         </w:rPr>
-        <w:t>Thành viên 1 · 3:15–4:30</w:t>
+        <w:t>Thời gian gợi ý: 3:15–4:30</w:t>
       </w:r>
     </w:p>
     <w:p>
@@ -664,7 +678,7 @@
           <w:color w:val="6B6B6B"/>
           <w:sz w:val="22"/>
         </w:rPr>
-        <w:t>Thành viên 1 · 4:30–5:45</w:t>
+        <w:t>Thời gian gợi ý: 4:30–5:45</w:t>
       </w:r>
     </w:p>
     <w:p>
@@ -763,7 +777,7 @@
           <w:i/>
           <w:sz w:val="22"/>
         </w:rPr>
-        <w:t>“Vậy cụ thể bản chất ấy là gì? Phần này bạn [thành viên 2] trình bày tiếp.”</w:t>
+        <w:t>“Vậy cụ thể bản chất ấy là gì?”</w:t>
       </w:r>
     </w:p>
     <w:p>
@@ -791,7 +805,7 @@
           <w:color w:val="6B6B6B"/>
           <w:sz w:val="22"/>
         </w:rPr>
-        <w:t>Thành viên 2 · 5:45–7:30</w:t>
+        <w:t>Thời gian gợi ý: 5:45–7:30</w:t>
       </w:r>
     </w:p>
     <w:p>
@@ -818,7 +832,7 @@
           <w:i w:val="0"/>
           <w:sz w:val="24"/>
         </w:rPr>
-        <w:t>Em cảm ơn bạn. Để hiểu bản chất của nền dân chủ này, nhóm em mượn một đoạn rất ngắn của Bác Hồ. Em đã che chữ cuối của mỗi câu. Em đọc, các bạn đoán giúp em chữ còn thiếu nhé.</w:t>
+        <w:t>Để hiểu bản chất của nền dân chủ này, nhóm em mượn một đoạn rất ngắn của Bác Hồ. Em đã che chữ cuối của mỗi câu. Em đọc, các bạn đoán giúp em chữ còn thiếu nhé.</w:t>
       </w:r>
     </w:p>
     <w:p>
@@ -918,7 +932,7 @@
           <w:color w:val="6B6B6B"/>
           <w:sz w:val="22"/>
         </w:rPr>
-        <w:t>Thành viên 2 · 7:30–8:30</w:t>
+        <w:t>Thời gian gợi ý: 7:30–8:30</w:t>
       </w:r>
     </w:p>
     <w:p>
@@ -945,7 +959,7 @@
           <w:i w:val="0"/>
           <w:sz w:val="24"/>
         </w:rPr>
-        <w:t>Mấy ý này lúc nãy bạn [thành viên 1] đã nhắc qua, ở đây nhóm em tách riêng ra cho dễ nhớ.</w:t>
+        <w:t>Mấy ý này lúc nãy mình đã nghe qua, ở đây nhóm em tách riêng ra cho dễ nhớ.</w:t>
       </w:r>
     </w:p>
     <w:p>
@@ -1032,7 +1046,7 @@
           <w:color w:val="6B6B6B"/>
           <w:sz w:val="22"/>
         </w:rPr>
-        <w:t>Thành viên 2 · 8:30–10:15</w:t>
+        <w:t>Thời gian gợi ý: 8:30–10:15</w:t>
       </w:r>
     </w:p>
     <w:p>
@@ -1172,7 +1186,7 @@
           <w:color w:val="6B6B6B"/>
           <w:sz w:val="22"/>
         </w:rPr>
-        <w:t>Thành viên 2 · 10:15–11:30</w:t>
+        <w:t>Thời gian gợi ý: 10:15–11:30</w:t>
       </w:r>
     </w:p>
     <w:p>
@@ -1299,7 +1313,7 @@
           <w:color w:val="6B6B6B"/>
           <w:sz w:val="22"/>
         </w:rPr>
-        <w:t>Thành viên 2 · 11:30–12:30</w:t>
+        <w:t>Thời gian gợi ý: 11:30–12:30</w:t>
       </w:r>
     </w:p>
     <w:p>
@@ -1400,7 +1414,7 @@
           <w:color w:val="6B6B6B"/>
           <w:sz w:val="22"/>
         </w:rPr>
-        <w:t>Thành viên 2 · 12:30–13:30</w:t>
+        <w:t>Thời gian gợi ý: 12:30–13:30</w:t>
       </w:r>
     </w:p>
     <w:p>
@@ -1486,7 +1500,7 @@
           <w:i/>
           <w:sz w:val="22"/>
         </w:rPr>
-        <w:t>“Lúc nãy mình nói, ở dân chủ gián tiếp, người dân giao quyền cho Nhà nước. Vậy Nhà nước đó phải là nhà nước như thế nào? Mời bạn [thành viên 3].”</w:t>
+        <w:t>“Lúc nãy mình nói, ở dân chủ gián tiếp, người dân giao quyền cho Nhà nước. Vậy Nhà nước đó phải là nhà nước như thế nào?”</w:t>
       </w:r>
     </w:p>
     <w:p>
@@ -1514,7 +1528,7 @@
           <w:color w:val="6B6B6B"/>
           <w:sz w:val="22"/>
         </w:rPr>
-        <w:t>Thành viên 3 · 13:30–14:45</w:t>
+        <w:t>Thời gian gợi ý: 13:30–14:45</w:t>
       </w:r>
     </w:p>
     <w:p>
@@ -1541,7 +1555,7 @@
           <w:i w:val="0"/>
           <w:sz w:val="24"/>
         </w:rPr>
-        <w:t>Em cảm ơn bạn. Trước khi nói về Nhà nước pháp quyền của Việt Nam, mình thống nhất với nhau một chút: nhà nước pháp quyền nói chung là gì đã.</w:t>
+        <w:t>Trước khi nói về Nhà nước pháp quyền của Việt Nam, mình thống nhất với nhau một chút: nhà nước pháp quyền nói chung là gì đã.</w:t>
       </w:r>
     </w:p>
     <w:p>
@@ -1628,7 +1642,7 @@
           <w:color w:val="6B6B6B"/>
           <w:sz w:val="22"/>
         </w:rPr>
-        <w:t>Thành viên 3 · 14:45–16:00</w:t>
+        <w:t>Thời gian gợi ý: 14:45–16:00</w:t>
       </w:r>
     </w:p>
     <w:p>
@@ -1742,7 +1756,7 @@
           <w:color w:val="6B6B6B"/>
           <w:sz w:val="22"/>
         </w:rPr>
-        <w:t>Thành viên 3 · 16:00–17:15</w:t>
+        <w:t>Thời gian gợi ý: 16:00–17:15</w:t>
       </w:r>
     </w:p>
     <w:p>
@@ -1856,7 +1870,7 @@
           <w:color w:val="6B6B6B"/>
           <w:sz w:val="22"/>
         </w:rPr>
-        <w:t>Thành viên 3 · 17:15–18:30</w:t>
+        <w:t>Thời gian gợi ý: 17:15–18:30</w:t>
       </w:r>
     </w:p>
     <w:p>
@@ -1983,7 +1997,7 @@
           <w:color w:val="6B6B6B"/>
           <w:sz w:val="22"/>
         </w:rPr>
-        <w:t>Thành viên 3 · 18:30–19:45</w:t>
+        <w:t>Thời gian gợi ý: 18:30–19:45</w:t>
       </w:r>
     </w:p>
     <w:p>
@@ -2097,7 +2111,7 @@
           <w:color w:val="6B6B6B"/>
           <w:sz w:val="22"/>
         </w:rPr>
-        <w:t>Thành viên 3 · 19:45–20:45</w:t>
+        <w:t>Thời gian gợi ý: 19:45–20:45</w:t>
       </w:r>
     </w:p>
     <w:p>
@@ -2198,7 +2212,7 @@
           <w:color w:val="6B6B6B"/>
           <w:sz w:val="22"/>
         </w:rPr>
-        <w:t>Thành viên 3 · 20:45–21:45</w:t>
+        <w:t>Thời gian gợi ý: 20:45–21:45</w:t>
       </w:r>
     </w:p>
     <w:p>
@@ -2271,7 +2285,7 @@
           <w:i/>
           <w:sz w:val="22"/>
         </w:rPr>
-        <w:t>“Hai phần đầu trả lời câu hỏi “là gì”. Phần ba trả lời câu hỏi “phải làm gì”. Mời bạn [thành viên 4].”</w:t>
+        <w:t>“Hai phần đầu trả lời câu hỏi “là gì”. Phần ba trả lời câu hỏi “phải làm gì”.”</w:t>
       </w:r>
     </w:p>
     <w:p>
@@ -2299,7 +2313,7 @@
           <w:color w:val="6B6B6B"/>
           <w:sz w:val="22"/>
         </w:rPr>
-        <w:t>Thành viên 4 · 21:45–23:00</w:t>
+        <w:t>Thời gian gợi ý: 21:45–23:00</w:t>
       </w:r>
     </w:p>
     <w:p>
@@ -2326,7 +2340,7 @@
           <w:i w:val="0"/>
           <w:sz w:val="24"/>
         </w:rPr>
-        <w:t>Em cảm ơn bạn. Phần ba có hai nhóm việc: nhóm a là phát huy dân chủ, có năm giải pháp; nhóm b là hoàn thiện Nhà nước pháp quyền, có bốn giải pháp. Em đi lần lượt.</w:t>
+        <w:t>Phần ba có hai nhóm việc: nhóm a là phát huy dân chủ, có năm giải pháp; nhóm b là hoàn thiện Nhà nước pháp quyền, có bốn giải pháp. Em đi lần lượt.</w:t>
       </w:r>
     </w:p>
     <w:p>
@@ -2400,7 +2414,7 @@
           <w:color w:val="6B6B6B"/>
           <w:sz w:val="22"/>
         </w:rPr>
-        <w:t>Thành viên 4 · 23:00–24:15</w:t>
+        <w:t>Thời gian gợi ý: 23:00–24:15</w:t>
       </w:r>
     </w:p>
     <w:p>
@@ -2514,7 +2528,7 @@
           <w:color w:val="6B6B6B"/>
           <w:sz w:val="22"/>
         </w:rPr>
-        <w:t>Thành viên 4 · 24:15–25:30</w:t>
+        <w:t>Thời gian gợi ý: 24:15–25:30</w:t>
       </w:r>
     </w:p>
     <w:p>
@@ -2654,7 +2668,7 @@
           <w:color w:val="6B6B6B"/>
           <w:sz w:val="22"/>
         </w:rPr>
-        <w:t>Thành viên 4 · 25:30–26:15</w:t>
+        <w:t>Thời gian gợi ý: 25:30–26:15</w:t>
       </w:r>
     </w:p>
     <w:p>
@@ -2755,7 +2769,7 @@
           <w:color w:val="6B6B6B"/>
           <w:sz w:val="22"/>
         </w:rPr>
-        <w:t>Thành viên 4 · 26:15–27:30</w:t>
+        <w:t>Thời gian gợi ý: 26:15–27:30</w:t>
       </w:r>
     </w:p>
     <w:p>
@@ -2869,7 +2883,7 @@
           <w:color w:val="6B6B6B"/>
           <w:sz w:val="22"/>
         </w:rPr>
-        <w:t>Thành viên 4 · 27:30–28:45</w:t>
+        <w:t>Thời gian gợi ý: 27:30–28:45</w:t>
       </w:r>
     </w:p>
     <w:p>
@@ -2996,7 +3010,7 @@
           <w:color w:val="6B6B6B"/>
           <w:sz w:val="22"/>
         </w:rPr>
-        <w:t>Thành viên 4 · 28:45–29:30</w:t>
+        <w:t>Thời gian gợi ý: 28:45–29:30</w:t>
       </w:r>
     </w:p>
     <w:p>
@@ -3056,7 +3070,7 @@
           <w:i/>
           <w:sz w:val="22"/>
         </w:rPr>
-        <w:t>“Phần của em đến đây là hết. Em mời bạn [thành viên 1] tổng kết.”</w:t>
+        <w:t>“Giờ mình nhìn lại cả bài.”</w:t>
       </w:r>
     </w:p>
     <w:p>
@@ -3084,7 +3098,7 @@
           <w:color w:val="6B6B6B"/>
           <w:sz w:val="22"/>
         </w:rPr>
-        <w:t>Thành viên 1 · 29:30–32:00</w:t>
+        <w:t>Thời gian gợi ý: 29:30–32:00</w:t>
       </w:r>
     </w:p>
     <w:p>
@@ -3111,7 +3125,7 @@
           <w:i w:val="0"/>
           <w:sz w:val="24"/>
         </w:rPr>
-        <w:t>Em cảm ơn bạn. Slide này gom cả bài lại. (bấm) Ba cột trên là ba phần mình vừa đi qua.</w:t>
+        <w:t>Slide này gom cả bài lại. (bấm) Ba cột trên là ba phần mình vừa đi qua.</w:t>
       </w:r>
     </w:p>
     <w:p>
@@ -3209,7 +3223,7 @@
           <w:color w:val="6B6B6B"/>
           <w:sz w:val="22"/>
         </w:rPr>
-        <w:t>Thành viên 1 · 32:00–32:30</w:t>
+        <w:t>Thời gian gợi ý: 32:00–32:30</w:t>
       </w:r>
     </w:p>
     <w:p>

</xml_diff>